<commit_message>
Add 450 DPI high-resolution IEEE PDF research paper and 1-click download buttons
</commit_message>
<xml_diff>
--- a/docs/IEEE_Research_Paper_Hamdan_Ali_233120.docx
+++ b/docs/IEEE_Research_Paper_Hamdan_Ali_233120.docx
@@ -3866,7 +3866,7 @@
       <w:r>
         <w:drawing>
           <wp:inline xmlns:a="http://schemas.openxmlformats.org/drawingml/2006/main" xmlns:pic="http://schemas.openxmlformats.org/drawingml/2006/picture">
-            <wp:extent cx="5669280" cy="3070860"/>
+            <wp:extent cx="5669280" cy="2165684"/>
             <wp:docPr id="1" name="Picture 1"/>
             <wp:cNvGraphicFramePr>
               <a:graphicFrameLocks noChangeAspect="1"/>
@@ -3887,7 +3887,7 @@
                   <pic:spPr>
                     <a:xfrm>
                       <a:off x="0" y="0"/>
-                      <a:ext cx="5669280" cy="3070860"/>
+                      <a:ext cx="5669280" cy="2165684"/>
                     </a:xfrm>
                     <a:prstGeom prst="rect"/>
                   </pic:spPr>
@@ -7969,7 +7969,7 @@
       <w:r>
         <w:drawing>
           <wp:inline xmlns:a="http://schemas.openxmlformats.org/drawingml/2006/main" xmlns:pic="http://schemas.openxmlformats.org/drawingml/2006/picture">
-            <wp:extent cx="5669280" cy="3401568"/>
+            <wp:extent cx="5669280" cy="3531556"/>
             <wp:docPr id="3" name="Picture 3"/>
             <wp:cNvGraphicFramePr>
               <a:graphicFrameLocks noChangeAspect="1"/>
@@ -7990,7 +7990,7 @@
                   <pic:spPr>
                     <a:xfrm>
                       <a:off x="0" y="0"/>
-                      <a:ext cx="5669280" cy="3401568"/>
+                      <a:ext cx="5669280" cy="3531556"/>
                     </a:xfrm>
                     <a:prstGeom prst="rect"/>
                   </pic:spPr>

</xml_diff>